<commit_message>
All twenty-two take-home sheets regenerated in John's simplified form (his word after the two samples fit on one page): title, the four parts with their box rows and Done boxes, the grace note as the only closer. Sessions 1 and 5 keep their crafted content; the rest carry each week's actual practice as part one. Synced to the FotH 2026 Homework Handouts folder. DEV ONLY.
Co-Authored-By: Claude Fable 5 <noreply@anthropic.com>
</commit_message>
<xml_diff>
--- a/_implementation-notes/evening-series/handouts/FotH Pilot Session 10 Homework Handout DRAFT v1.docx
+++ b/_implementation-notes/evening-series/handouts/FotH Pilot Session 10 Homework Handout DRAFT v1.docx
@@ -12,27 +12,10 @@
       </w:r>
     </w:p>
     <w:p>
-      <w:pPr>
-        <w:pStyle w:val="FirstParagraph"/>
-      </w:pPr>
-      <w:r>
-        <w:rPr>
-          <w:b/>
-          <w:bCs/>
-        </w:rPr>
-        <w:t xml:space="preserve">Two weeks on one sheet: the practices, the boxes, the check-in.</w:t>
-      </w:r>
-      <w:r>
-        <w:t xml:space="preserve"> </w:t>
-      </w:r>
-      <w:r>
-        <w:t xml:space="preserve">Evening</w:t>
-      </w:r>
-      <w:r>
-        <w:t xml:space="preserve"> </w:t>
-      </w:r>
-      <w:r>
-        <w:t xml:space="preserve">series at the Tittle home. Fridge, mirror, or notebook pocket.</w:t>
+      <w:r>
+        <w:pict>
+          <v:rect style="width:0;height:1.5pt" o:hralign="center" o:hrstd="t" o:hr="t"/>
+        </w:pict>
       </w:r>
     </w:p>
     <w:bookmarkStart w:id="9" w:name="the-practice-week-one"/>
@@ -95,7 +78,7 @@
         <w:pStyle w:val="FirstParagraph"/>
       </w:pPr>
       <w:r>
-        <w:t xml:space="preserve">My check-in partner this cycle is:</w:t>
+        <w:t xml:space="preserve">My check-in partner for this cycle is:</w:t>
       </w:r>
       <w:r>
         <w:t xml:space="preserve"> </w:t>
@@ -111,19 +94,31 @@
         <w:t xml:space="preserve"> </w:t>
       </w:r>
       <w:r>
-        <w:t xml:space="preserve">At the end of week one, connect and report how it’s going against the</w:t>
+        <w:rPr>
+          <w:i/>
+          <w:iCs/>
+        </w:rPr>
+        <w:t xml:space="preserve">(named aloud at commissioning; a new partner each cycle)</w:t>
+      </w:r>
+    </w:p>
+    <w:p>
+      <w:pPr>
+        <w:pStyle w:val="BodyText"/>
+      </w:pPr>
+      <w:r>
+        <w:t xml:space="preserve">At the end of week one, connect with your partner and report how it’s going</w:t>
       </w:r>
       <w:r>
         <w:t xml:space="preserve"> </w:t>
       </w:r>
       <w:r>
-        <w:t xml:space="preserve">practice. A text, a call, or a hallway conversation all count. You are not</w:t>
+        <w:t xml:space="preserve">against the practice. A text, a call, or a hallway conversation all count.</w:t>
       </w:r>
       <w:r>
         <w:t xml:space="preserve"> </w:t>
       </w:r>
       <w:r>
-        <w:t xml:space="preserve">grading each other; you are expecting each other.</w:t>
+        <w:t xml:space="preserve">You are not grading each other; you are expecting each other.</w:t>
       </w:r>
       <w:r>
         <w:t xml:space="preserve"> </w:t>
@@ -157,7 +152,13 @@
         <w:pStyle w:val="FirstParagraph"/>
       </w:pPr>
       <w:r>
-        <w:t xml:space="preserve">Continue or deepen the same practice, as the session specifies; journal what happens.</w:t>
+        <w:t xml:space="preserve">Continue or deepen the same practice, as the session specifies; journal</w:t>
+      </w:r>
+      <w:r>
+        <w:t xml:space="preserve"> </w:t>
+      </w:r>
+      <w:r>
+        <w:t xml:space="preserve">what happens.</w:t>
       </w:r>
     </w:p>
     <w:p>
@@ -229,109 +230,6 @@
           <w:iCs/>
         </w:rPr>
         <w:t xml:space="preserve">A missed box is never a failure — it is an invitation to return.</w:t>
-      </w:r>
-    </w:p>
-    <w:p>
-      <w:pPr>
-        <w:pStyle w:val="BodyText"/>
-      </w:pPr>
-      <w:r>
-        <w:rPr>
-          <w:b/>
-          <w:bCs/>
-        </w:rPr>
-        <w:t xml:space="preserve">The journal’s standing closer, every week:</w:t>
-      </w:r>
-      <w:r>
-        <w:t xml:space="preserve"> </w:t>
-      </w:r>
-      <w:r>
-        <w:rPr>
-          <w:i/>
-          <w:iCs/>
-        </w:rPr>
-        <w:t xml:space="preserve">if I were to teach this</w:t>
-      </w:r>
-      <w:r>
-        <w:rPr>
-          <w:i/>
-          <w:iCs/>
-        </w:rPr>
-        <w:t xml:space="preserve"> </w:t>
-      </w:r>
-      <w:r>
-        <w:rPr>
-          <w:i/>
-          <w:iCs/>
-        </w:rPr>
-        <w:t xml:space="preserve">practice to someone, what would I tell them?</w:t>
-      </w:r>
-    </w:p>
-    <w:p>
-      <w:pPr>
-        <w:pStyle w:val="BodyText"/>
-      </w:pPr>
-      <w:r>
-        <w:rPr>
-          <w:b/>
-          <w:bCs/>
-        </w:rPr>
-        <w:t xml:space="preserve">Next evening:</w:t>
-      </w:r>
-      <w:r>
-        <w:t xml:space="preserve"> </w:t>
-      </w:r>
-      <w:r>
-        <w:t xml:space="preserve">____________ (Mon/Tue of the week of ____________), dinner</w:t>
-      </w:r>
-      <w:r>
-        <w:t xml:space="preserve"> </w:t>
-      </w:r>
-      <w:r>
-        <w:t xml:space="preserve">at 6:00, session at 7:00.</w:t>
-      </w:r>
-    </w:p>
-    <w:p>
-      <w:pPr>
-        <w:pStyle w:val="BodyText"/>
-      </w:pPr>
-      <w:r>
-        <w:rPr>
-          <w:b/>
-          <w:bCs/>
-        </w:rPr>
-        <w:t xml:space="preserve">The door out:</w:t>
-      </w:r>
-      <w:r>
-        <w:t xml:space="preserve"> </w:t>
-      </w:r>
-      <w:r>
-        <w:t xml:space="preserve">if anything from this work needs an adult outside the</w:t>
-      </w:r>
-      <w:r>
-        <w:t xml:space="preserve"> </w:t>
-      </w:r>
-      <w:r>
-        <w:t xml:space="preserve">leading team, that person is</w:t>
-      </w:r>
-      <w:r>
-        <w:t xml:space="preserve"> </w:t>
-      </w:r>
-      <w:r>
-        <w:rPr>
-          <w:b/>
-          <w:bCs/>
-        </w:rPr>
-        <w:t xml:space="preserve">Pastor Bobby Gore, (831) 277-9878</w:t>
-      </w:r>
-      <w:r>
-        <w:t xml:space="preserve">, and</w:t>
-      </w:r>
-      <w:r>
-        <w:t xml:space="preserve"> </w:t>
-      </w:r>
-      <w:r>
-        <w:t xml:space="preserve">going to them is always the right move.</w:t>
       </w:r>
     </w:p>
     <w:bookmarkEnd w:id="12"/>

</xml_diff>